<commit_message>
Cinco modelos de alquiler: garaje, temporada, local, requerimiento y mutuo acuerdo
</commit_message>
<xml_diff>
--- a/modelos/contrato-alquiler-garaje.docx
+++ b/modelos/contrato-alquiler-garaje.docx
@@ -23,7 +23,7 @@
           <w:b/>
           <w:sz w:val="24"/>
         </w:rPr>
-        <w:t>Una plaza independiente, no un anexo de vivienda</w:t>
+        <w:t>Plaza independiente bajo el Código Civil</w:t>
       </w:r>
     </w:p>
     <w:p>
@@ -40,7 +40,7 @@
         <w:t>separadamente</w:t>
       </w:r>
       <w:r>
-        <w:t>. Si se alquila como accesorio de una vivienda por el mismo arrendador, el artículo 2.2 LAU extiende el régimen de vivienda al accesorio y hay que adaptarlo conjuntamente. En una plaza independiente debe comprobarse su encaje en el Código Civil o, según el inmueble y objeto, en la LAU para uso distinto; no existe una calificación universal por llamar al contrato «garaje».</w:t>
+        <w:t>. Si se alquila como accesorio de una vivienda por el mismo arrendador, el artículo 2.2 LAU extiende el régimen de vivienda al accesorio y hay que adaptarlo conjuntamente. Este modelo usa el Código Civil (arts. 1255, 1543, 1554, 1555, 1561, 1566 y 1569), con duración y garantía pactadas. En una plaza independiente debe comprobarse su encaje en el Código Civil o, según el inmueble y objeto, en la LAU para uso distinto; no existe una calificación universal por llamar al contrato «garaje».</w:t>
       </w:r>
     </w:p>
     <w:p>
@@ -272,7 +272,7 @@
         <w:t>Fuentes:</w:t>
       </w:r>
       <w:r>
-        <w:t xml:space="preserve"> LAU, artículos 2, 3 y 36 (https://www.boe.es/buscar/act.php?id=BOE-A-1994-26003), Ley del IVA, artículos 20.Uno.23 y 90 (https://www.boe.es/buscar/act.php?id=BOE-A-1992-28740) y Agencia Tributaria: IVA en plazas de garaje (https://sede.agenciatributaria.gob.es/Sede/iva/iva-operaciones-inmobiliarias/preguntas-frecuentes-sobre-iva-arrendamiento-inmuebles/exenciones.html). Consultadas el 5 de octubre de 2026. No es asesoramiento jurídico. Adapta el recibo de llaves y mandos (https://cirameva.com/modelos/recibo-entrega-llaves/).</w:t>
+        <w:t xml:space="preserve"> Código Civil, arts. 1543 y siguientes (https://www.boe.es/buscar/act.php?id=BOE-A-1889-4763#art1543), LAU, artículos 2, 3 y 36 (https://www.boe.es/buscar/act.php?id=BOE-A-1994-26003), Ley del IVA, artículos 20.Uno.23 y 90 (https://www.boe.es/buscar/act.php?id=BOE-A-1992-28740) y Agencia Tributaria: IVA en plazas de garaje (https://sede.agenciatributaria.gob.es/Sede/iva/iva-operaciones-inmobiliarias/preguntas-frecuentes-sobre-iva-arrendamiento-inmuebles/exenciones.html). Consultadas el 5 de octubre de 2026. No es asesoramiento jurídico. Adapta el recibo de llaves y mandos (https://cirameva.com/modelos/recibo-entrega-llaves/).</w:t>
       </w:r>
     </w:p>
     <w:p>

</xml_diff>